<commit_message>
Drop AI-use mention from the cover letter (kept in manuscript + title page)
Co-Authored-By: Claude Opus 4.7 (1M context) <noreply@anthropic.com>
</commit_message>
<xml_diff>
--- a/submission/cover_letter.docx
+++ b/submission/cover_letter.docx
@@ -270,25 +270,7 @@
         <w:t xml:space="preserve"> </w:t>
       </w:r>
       <w:r>
-        <w:t xml:space="preserve">can use it directly and inspect its source and tests. As a disclosure, AI-based</w:t>
-      </w:r>
-      <w:r>
-        <w:t xml:space="preserve"> </w:t>
-      </w:r>
-      <w:r>
-        <w:t xml:space="preserve">coding assistants were used as programming aids during the software’s</w:t>
-      </w:r>
-      <w:r>
-        <w:t xml:space="preserve"> </w:t>
-      </w:r>
-      <w:r>
-        <w:t xml:space="preserve">development; all statistical methods and results were specified by the author</w:t>
-      </w:r>
-      <w:r>
-        <w:t xml:space="preserve"> </w:t>
-      </w:r>
-      <w:r>
-        <w:t xml:space="preserve">and verified against the independent references described in the manuscript.</w:t>
+        <w:t xml:space="preserve">can use it directly and inspect its source and tests.</w:t>
       </w:r>
     </w:p>
     <w:p>

</xml_diff>

<commit_message>
Cover letter: add USI position, modular-synth/analog-computing origin; remove em dashes
Co-Authored-By: Claude Opus 4.7 (1M context) <noreply@anthropic.com>
</commit_message>
<xml_diff>
--- a/submission/cover_letter.docx
+++ b/submission/cover_letter.docx
@@ -13,6 +13,12 @@
         <w:t xml:space="preserve"> </w:t>
       </w:r>
       <w:r>
+        <w:t xml:space="preserve">Institute of Communication and Public Policy</w:t>
+      </w:r>
+      <w:r>
+        <w:t xml:space="preserve"> </w:t>
+      </w:r>
+      <w:r>
         <w:t xml:space="preserve">Università della Svizzera italiana (USI)</w:t>
       </w:r>
       <w:r>
@@ -110,13 +116,13 @@
         <w:pStyle w:val="BodyText"/>
       </w:pPr>
       <w:r>
-        <w:t xml:space="preserve">Simulation-based reasoning—having students build a sampling distribution</w:t>
-      </w:r>
-      <w:r>
-        <w:t xml:space="preserve"> </w:t>
-      </w:r>
-      <w:r>
-        <w:t xml:space="preserve">empirically before they meet it as a formula—is now a mainstream goal of</w:t>
+        <w:t xml:space="preserve">Simulation-based reasoning, in which students build a sampling distribution</w:t>
+      </w:r>
+      <w:r>
+        <w:t xml:space="preserve"> </w:t>
+      </w:r>
+      <w:r>
+        <w:t xml:space="preserve">empirically before they meet it as a formula, is now a mainstream goal of</w:t>
       </w:r>
       <w:r>
         <w:t xml:space="preserve"> </w:t>
@@ -232,7 +238,7 @@
         <w:t xml:space="preserve"> </w:t>
       </w:r>
       <w:r>
-        <w:t xml:space="preserve">with a script that regenerates every reference value independently—so the</w:t>
+        <w:t xml:space="preserve">with a script that regenerates every reference value independently, so the</w:t>
       </w:r>
       <w:r>
         <w:t xml:space="preserve"> </w:t>
@@ -245,6 +251,86 @@
       </w:r>
       <w:r>
         <w:t xml:space="preserve">plausible.</w:t>
+      </w:r>
+    </w:p>
+    <w:p>
+      <w:pPr>
+        <w:pStyle w:val="BodyText"/>
+      </w:pPr>
+      <w:r>
+        <w:t xml:space="preserve">A brief word on where this comes from. I am a postdoctoral researcher at the</w:t>
+      </w:r>
+      <w:r>
+        <w:t xml:space="preserve"> </w:t>
+      </w:r>
+      <w:r>
+        <w:t xml:space="preserve">Institute of Communication and Public Policy at USI, where my work concerns</w:t>
+      </w:r>
+      <w:r>
+        <w:t xml:space="preserve"> </w:t>
+      </w:r>
+      <w:r>
+        <w:t xml:space="preserve">quantitative methods in the social sciences. Empiria grew out of an unexpected</w:t>
+      </w:r>
+      <w:r>
+        <w:t xml:space="preserve"> </w:t>
+      </w:r>
+      <w:r>
+        <w:t xml:space="preserve">overlap between that work and a long-standing hobby of mine, patching modular</w:t>
+      </w:r>
+      <w:r>
+        <w:t xml:space="preserve"> </w:t>
+      </w:r>
+      <w:r>
+        <w:t xml:space="preserve">synthesizers. A modular synth is a live, visual, tactile computer: you build a</w:t>
+      </w:r>
+      <w:r>
+        <w:t xml:space="preserve"> </w:t>
+      </w:r>
+      <w:r>
+        <w:t xml:space="preserve">process by wiring small modules together and hear it change as you turn a knob.</w:t>
+      </w:r>
+      <w:r>
+        <w:t xml:space="preserve"> </w:t>
+      </w:r>
+      <w:r>
+        <w:t xml:space="preserve">That is also the spirit of the older analog-computing tradition, in which a</w:t>
+      </w:r>
+      <w:r>
+        <w:t xml:space="preserve"> </w:t>
+      </w:r>
+      <w:r>
+        <w:t xml:space="preserve">calculation was something physical you could see and adjust rather than a hidden</w:t>
+      </w:r>
+      <w:r>
+        <w:t xml:space="preserve"> </w:t>
+      </w:r>
+      <w:r>
+        <w:t xml:space="preserve">function call. Empiria brings that sensibility to statistics, so that the</w:t>
+      </w:r>
+      <w:r>
+        <w:t xml:space="preserve"> </w:t>
+      </w:r>
+      <w:r>
+        <w:t xml:space="preserve">inferential workflow becomes something a student assembles, touches, and watches</w:t>
+      </w:r>
+      <w:r>
+        <w:t xml:space="preserve"> </w:t>
+      </w:r>
+      <w:r>
+        <w:t xml:space="preserve">respond in real time. I have written the article for practitioners, in the hope</w:t>
+      </w:r>
+      <w:r>
+        <w:t xml:space="preserve"> </w:t>
+      </w:r>
+      <w:r>
+        <w:t xml:space="preserve">of adding to the conversation about hands-on and alternative ways of conveying</w:t>
+      </w:r>
+      <w:r>
+        <w:t xml:space="preserve"> </w:t>
+      </w:r>
+      <w:r>
+        <w:t xml:space="preserve">statistical ideas.</w:t>
       </w:r>
     </w:p>
     <w:p>

</xml_diff>

<commit_message>
Resubmission to Teaching Statistics: classroom-use expansion, teaching context, informal feedback (themes-only), ethics statement, abstract refresh, em-dash sweep, v2.2.0
Co-Authored-By: Claude Opus 4.7 (1M context) <noreply@anthropic.com>
</commit_message>
<xml_diff>
--- a/submission/cover_letter.docx
+++ b/submission/cover_letter.docx
@@ -71,44 +71,151 @@
         <w:pStyle w:val="BodyText"/>
       </w:pPr>
       <w:r>
-        <w:t xml:space="preserve">I am pleased to submit an original article,</w:t>
-      </w:r>
-      <w:r>
-        <w:t xml:space="preserve"> </w:t>
-      </w:r>
-      <w:r>
-        <w:t xml:space="preserve">“Empiria: A Composable,</w:t>
-      </w:r>
-      <w:r>
-        <w:t xml:space="preserve"> </w:t>
-      </w:r>
-      <w:r>
-        <w:t xml:space="preserve">Browser-Based Environment for Simulation-Based Statistics Education,”</w:t>
-      </w:r>
-      <w:r>
-        <w:t xml:space="preserve"> </w:t>
-      </w:r>
-      <w:r>
-        <w:t xml:space="preserve">for</w:t>
-      </w:r>
-      <w:r>
-        <w:t xml:space="preserve"> </w:t>
-      </w:r>
-      <w:r>
-        <w:t xml:space="preserve">consideration in</w:t>
-      </w:r>
-      <w:r>
-        <w:t xml:space="preserve"> </w:t>
-      </w:r>
-      <w:r>
-        <w:rPr>
+        <w:t xml:space="preserve">Thank you for the constructive decision letter on my earlier submission</w:t>
+      </w:r>
+      <w:r>
+        <w:t xml:space="preserve"> </w:t>
+      </w:r>
+      <w:r>
+        <w:t xml:space="preserve">(manuscript 5250955,</w:t>
+      </w:r>
+      <w:r>
+        <w:t xml:space="preserve"> </w:t>
+      </w:r>
+      <w:r>
+        <w:t xml:space="preserve">“Empiria: A Composable, Browser-Based Environment for</w:t>
+      </w:r>
+      <w:r>
+        <w:t xml:space="preserve"> </w:t>
+      </w:r>
+      <w:r>
+        <w:t xml:space="preserve">Simulation-Based Statistics Education”</w:t>
+      </w:r>
+      <w:r>
+        <w:t xml:space="preserve">). The three concerns you raised have</w:t>
+      </w:r>
+      <w:r>
+        <w:t xml:space="preserve"> </w:t>
+      </w:r>
+      <w:r>
+        <w:t xml:space="preserve">driven a substantial revision, which I am pleased to submit for your</w:t>
+      </w:r>
+      <w:r>
+        <w:t xml:space="preserve"> </w:t>
+      </w:r>
+      <w:r>
+        <w:t xml:space="preserve">consideration. I have addressed each of your points directly.</w:t>
+      </w:r>
+    </w:p>
+    <w:p>
+      <w:pPr>
+        <w:pStyle w:val="BodyText"/>
+      </w:pPr>
+      <w:r>
+        <w:rPr>
+          <w:b/>
+          <w:bCs/>
+        </w:rPr>
+        <w:t xml:space="preserve">1. Expanded</w:t>
+      </w:r>
+      <w:r>
+        <w:rPr>
+          <w:b/>
+          <w:bCs/>
+        </w:rPr>
+        <w:t xml:space="preserve"> </w:t>
+      </w:r>
+      <w:r>
+        <w:rPr>
+          <w:b/>
+          <w:bCs/>
           <w:i/>
           <w:iCs/>
         </w:rPr>
-        <w:t xml:space="preserve">Teaching Statistics</w:t>
-      </w:r>
-      <w:r>
+        <w:t xml:space="preserve">Illustrative classroom use</w:t>
+      </w:r>
+      <w:r>
+        <w:rPr>
+          <w:b/>
+          <w:bCs/>
+        </w:rPr>
         <w:t xml:space="preserve">.</w:t>
+      </w:r>
+      <w:r>
+        <w:t xml:space="preserve"> </w:t>
+      </w:r>
+      <w:r>
+        <w:t xml:space="preserve">The previous short paragraph has</w:t>
+      </w:r>
+      <w:r>
+        <w:t xml:space="preserve"> </w:t>
+      </w:r>
+      <w:r>
+        <w:t xml:space="preserve">been replaced by six detailed lesson walkthroughs. For each of the law of</w:t>
+      </w:r>
+      <w:r>
+        <w:t xml:space="preserve"> </w:t>
+      </w:r>
+      <w:r>
+        <w:t xml:space="preserve">large numbers, the meaning of</w:t>
+      </w:r>
+      <w:r>
+        <w:t xml:space="preserve"> </w:t>
+      </w:r>
+      <w:r>
+        <w:t xml:space="preserve">“95% confidence”</w:t>
+      </w:r>
+      <w:r>
+        <w:t xml:space="preserve">, the bootstrap sampling</w:t>
+      </w:r>
+      <w:r>
+        <w:t xml:space="preserve"> </w:t>
+      </w:r>
+      <w:r>
+        <w:t xml:space="preserve">distribution, Welch’s two-sample</w:t>
+      </w:r>
+      <w:r>
+        <w:t xml:space="preserve"> </w:t>
+      </w:r>
+      <w:r>
+        <w:rPr>
+          <w:i/>
+          <w:iCs/>
+        </w:rPr>
+        <w:t xml:space="preserve">t</w:t>
+      </w:r>
+      <w:r>
+        <w:t xml:space="preserve">, building a data-generating process from</w:t>
+      </w:r>
+      <w:r>
+        <w:t xml:space="preserve"> </w:t>
+      </w:r>
+      <w:r>
+        <w:t xml:space="preserve">interchangeable parts, and false positives under the null, the revised text</w:t>
+      </w:r>
+      <w:r>
+        <w:t xml:space="preserve"> </w:t>
+      </w:r>
+      <w:r>
+        <w:t xml:space="preserve">gives the target audience, the mode of use (in-lecture demonstration,</w:t>
+      </w:r>
+      <w:r>
+        <w:t xml:space="preserve"> </w:t>
+      </w:r>
+      <w:r>
+        <w:t xml:space="preserve">computer lab, homework, group exploration), an approximate duration, what the</w:t>
+      </w:r>
+      <w:r>
+        <w:t xml:space="preserve"> </w:t>
+      </w:r>
+      <w:r>
+        <w:t xml:space="preserve">student does and observes step by step, and the misconception or learning</w:t>
+      </w:r>
+      <w:r>
+        <w:t xml:space="preserve"> </w:t>
+      </w:r>
+      <w:r>
+        <w:t xml:space="preserve">objective the activity targets.</w:t>
       </w:r>
     </w:p>
     <w:p>
@@ -116,67 +223,89 @@
         <w:pStyle w:val="BodyText"/>
       </w:pPr>
       <w:r>
-        <w:t xml:space="preserve">Simulation-based reasoning, in which students build a sampling distribution</w:t>
-      </w:r>
-      <w:r>
-        <w:t xml:space="preserve"> </w:t>
-      </w:r>
-      <w:r>
-        <w:t xml:space="preserve">empirically before they meet it as a formula, is now a mainstream goal of</w:t>
-      </w:r>
-      <w:r>
-        <w:t xml:space="preserve"> </w:t>
-      </w:r>
-      <w:r>
-        <w:t xml:space="preserve">statistics teaching, but the supporting software is typically siloed: each</w:t>
-      </w:r>
-      <w:r>
-        <w:t xml:space="preserve"> </w:t>
-      </w:r>
-      <w:r>
-        <w:t xml:space="preserve">applet addresses one concept and cannot pass its output to the next step, so</w:t>
-      </w:r>
-      <w:r>
-        <w:t xml:space="preserve"> </w:t>
-      </w:r>
-      <w:r>
-        <w:t xml:space="preserve">the workflow students must internalize stays implicit. The article introduces</w:t>
-      </w:r>
-      <w:r>
-        <w:t xml:space="preserve"> </w:t>
-      </w:r>
-      <w:r>
-        <w:t xml:space="preserve">Empiria, a free, open-source, browser-based environment that makes that</w:t>
-      </w:r>
-      <w:r>
-        <w:t xml:space="preserve"> </w:t>
-      </w:r>
-      <w:r>
-        <w:t xml:space="preserve">workflow explicit by representing it as a composable dataflow graph: students</w:t>
-      </w:r>
-      <w:r>
-        <w:t xml:space="preserve"> </w:t>
-      </w:r>
-      <w:r>
-        <w:t xml:space="preserve">wire small modules together and watch every intermediate quantity update in</w:t>
-      </w:r>
-      <w:r>
-        <w:t xml:space="preserve"> </w:t>
-      </w:r>
-      <w:r>
-        <w:t xml:space="preserve">real time. It requires no installation, runs on any modern device (including</w:t>
-      </w:r>
-      <w:r>
-        <w:t xml:space="preserve"> </w:t>
-      </w:r>
-      <w:r>
-        <w:t xml:space="preserve">Chromebooks and tablets), and ships sixteen ready-to-use lesson worksheets and</w:t>
-      </w:r>
-      <w:r>
-        <w:t xml:space="preserve"> </w:t>
-      </w:r>
-      <w:r>
-        <w:t xml:space="preserve">a short guided tour, so an instructor can adopt it without preparation.</w:t>
+        <w:rPr>
+          <w:b/>
+          <w:bCs/>
+        </w:rPr>
+        <w:t xml:space="preserve">2. A new</w:t>
+      </w:r>
+      <w:r>
+        <w:rPr>
+          <w:b/>
+          <w:bCs/>
+        </w:rPr>
+        <w:t xml:space="preserve"> </w:t>
+      </w:r>
+      <w:r>
+        <w:rPr>
+          <w:b/>
+          <w:bCs/>
+          <w:i/>
+          <w:iCs/>
+        </w:rPr>
+        <w:t xml:space="preserve">Teaching and learning context</w:t>
+      </w:r>
+      <w:r>
+        <w:rPr>
+          <w:b/>
+          <w:bCs/>
+        </w:rPr>
+        <w:t xml:space="preserve"> </w:t>
+      </w:r>
+      <w:r>
+        <w:rPr>
+          <w:b/>
+          <w:bCs/>
+        </w:rPr>
+        <w:t xml:space="preserve">section.</w:t>
+      </w:r>
+      <w:r>
+        <w:t xml:space="preserve"> </w:t>
+      </w:r>
+      <w:r>
+        <w:t xml:space="preserve">Inserted before the</w:t>
+      </w:r>
+      <w:r>
+        <w:t xml:space="preserve"> </w:t>
+      </w:r>
+      <w:r>
+        <w:t xml:space="preserve">lessons, this section identifies the three audiences the tool serves</w:t>
+      </w:r>
+      <w:r>
+        <w:t xml:space="preserve"> </w:t>
+      </w:r>
+      <w:r>
+        <w:t xml:space="preserve">(general-education and first quantitative courses; introductory undergraduate</w:t>
+      </w:r>
+      <w:r>
+        <w:t xml:space="preserve"> </w:t>
+      </w:r>
+      <w:r>
+        <w:t xml:space="preserve">statistics across the social and life sciences; methods courses for advanced</w:t>
+      </w:r>
+      <w:r>
+        <w:t xml:space="preserve"> </w:t>
+      </w:r>
+      <w:r>
+        <w:t xml:space="preserve">undergraduate and postgraduate students), the modes of use the lessons</w:t>
+      </w:r>
+      <w:r>
+        <w:t xml:space="preserve"> </w:t>
+      </w:r>
+      <w:r>
+        <w:t xml:space="preserve">support, and the pacing and preparation an instructor can expect (typical</w:t>
+      </w:r>
+      <w:r>
+        <w:t xml:space="preserve"> </w:t>
+      </w:r>
+      <w:r>
+        <w:t xml:space="preserve">activities 10 to 45 minutes; preparation on the order of ten minutes per</w:t>
+      </w:r>
+      <w:r>
+        <w:t xml:space="preserve"> </w:t>
+      </w:r>
+      <w:r>
+        <w:t xml:space="preserve">lesson; no installation on lab machines).</w:t>
       </w:r>
     </w:p>
     <w:p>
@@ -184,73 +313,226 @@
         <w:pStyle w:val="BodyText"/>
       </w:pPr>
       <w:r>
-        <w:t xml:space="preserve">I believe the article fits the journal’s emphasis on good practice in teaching</w:t>
-      </w:r>
-      <w:r>
-        <w:t xml:space="preserve"> </w:t>
-      </w:r>
-      <w:r>
-        <w:t xml:space="preserve">in three ways. First, it offers a concrete, classroom-ready way to teach the</w:t>
-      </w:r>
-      <w:r>
-        <w:t xml:space="preserve"> </w:t>
-      </w:r>
-      <w:r>
-        <w:t xml:space="preserve">inferential workflow as a single connected picture rather than a sequence of</w:t>
-      </w:r>
-      <w:r>
-        <w:t xml:space="preserve"> </w:t>
-      </w:r>
-      <w:r>
-        <w:t xml:space="preserve">disconnected demonstrations, with bundled activities that span</w:t>
-      </w:r>
-      <w:r>
-        <w:t xml:space="preserve"> </w:t>
-      </w:r>
-      <w:r>
-        <w:t xml:space="preserve">general-education through introductory and graduate courses. Second, it is</w:t>
-      </w:r>
-      <w:r>
-        <w:t xml:space="preserve"> </w:t>
-      </w:r>
-      <w:r>
-        <w:t xml:space="preserve">grounded in the statistics-education literature on dynamic visualization and</w:t>
-      </w:r>
-      <w:r>
-        <w:t xml:space="preserve"> </w:t>
-      </w:r>
-      <w:r>
-        <w:t xml:space="preserve">simulation-based inference. Third, and unusually for a teaching tool, its</w:t>
-      </w:r>
-      <w:r>
-        <w:t xml:space="preserve"> </w:t>
-      </w:r>
-      <w:r>
-        <w:t xml:space="preserve">numerical routines use exact recipes rather than normal-theory approximations</w:t>
-      </w:r>
-      <w:r>
-        <w:t xml:space="preserve"> </w:t>
-      </w:r>
-      <w:r>
-        <w:t xml:space="preserve">and are verified against R to machine precision by an automated test suite,</w:t>
-      </w:r>
-      <w:r>
-        <w:t xml:space="preserve"> </w:t>
-      </w:r>
-      <w:r>
-        <w:t xml:space="preserve">with a script that regenerates every reference value independently, so the</w:t>
-      </w:r>
-      <w:r>
-        <w:t xml:space="preserve"> </w:t>
-      </w:r>
-      <w:r>
-        <w:t xml:space="preserve">numbers an instructor puts in front of students are auditable, not merely</w:t>
-      </w:r>
-      <w:r>
-        <w:t xml:space="preserve"> </w:t>
-      </w:r>
-      <w:r>
-        <w:t xml:space="preserve">plausible.</w:t>
+        <w:rPr>
+          <w:b/>
+          <w:bCs/>
+        </w:rPr>
+        <w:t xml:space="preserve">3. A new</w:t>
+      </w:r>
+      <w:r>
+        <w:rPr>
+          <w:b/>
+          <w:bCs/>
+        </w:rPr>
+        <w:t xml:space="preserve"> </w:t>
+      </w:r>
+      <w:r>
+        <w:rPr>
+          <w:b/>
+          <w:bCs/>
+          <w:i/>
+          <w:iCs/>
+        </w:rPr>
+        <w:t xml:space="preserve">Informal feedback and design evolution</w:t>
+      </w:r>
+      <w:r>
+        <w:rPr>
+          <w:b/>
+          <w:bCs/>
+        </w:rPr>
+        <w:t xml:space="preserve"> </w:t>
+      </w:r>
+      <w:r>
+        <w:rPr>
+          <w:b/>
+          <w:bCs/>
+        </w:rPr>
+        <w:t xml:space="preserve">section.</w:t>
+      </w:r>
+      <w:r>
+        <w:t xml:space="preserve"> </w:t>
+      </w:r>
+      <w:r>
+        <w:t xml:space="preserve">The revised</w:t>
+      </w:r>
+      <w:r>
+        <w:t xml:space="preserve"> </w:t>
+      </w:r>
+      <w:r>
+        <w:t xml:space="preserve">manuscript describes how the tool and the paper changed in response to</w:t>
+      </w:r>
+      <w:r>
+        <w:t xml:space="preserve"> </w:t>
+      </w:r>
+      <w:r>
+        <w:t xml:space="preserve">informal practitioner input gathered during development: students who tried</w:t>
+      </w:r>
+      <w:r>
+        <w:t xml:space="preserve"> </w:t>
+      </w:r>
+      <w:r>
+        <w:t xml:space="preserve">the running application, and a small set of colleagues teaching introductory</w:t>
+      </w:r>
+      <w:r>
+        <w:t xml:space="preserve"> </w:t>
+      </w:r>
+      <w:r>
+        <w:t xml:space="preserve">statistics who responded to an open call for impressions, raised two recurring</w:t>
+      </w:r>
+      <w:r>
+        <w:t xml:space="preserve"> </w:t>
+      </w:r>
+      <w:r>
+        <w:t xml:space="preserve">themes. The first was</w:t>
+      </w:r>
+      <w:r>
+        <w:t xml:space="preserve"> </w:t>
+      </w:r>
+      <w:r>
+        <w:rPr>
+          <w:i/>
+          <w:iCs/>
+        </w:rPr>
+        <w:t xml:space="preserve">applicability</w:t>
+      </w:r>
+      <w:r>
+        <w:t xml:space="preserve"> </w:t>
+      </w:r>
+      <w:r>
+        <w:t xml:space="preserve">to a specific course’s teaching goals;</w:t>
+      </w:r>
+      <w:r>
+        <w:t xml:space="preserve"> </w:t>
+      </w:r>
+      <w:r>
+        <w:t xml:space="preserve">the second was the</w:t>
+      </w:r>
+      <w:r>
+        <w:t xml:space="preserve"> </w:t>
+      </w:r>
+      <w:r>
+        <w:rPr>
+          <w:i/>
+          <w:iCs/>
+        </w:rPr>
+        <w:t xml:space="preserve">activation cost</w:t>
+      </w:r>
+      <w:r>
+        <w:t xml:space="preserve"> </w:t>
+      </w:r>
+      <w:r>
+        <w:t xml:space="preserve">of a node-and-cable interface for</w:t>
+      </w:r>
+      <w:r>
+        <w:t xml:space="preserve"> </w:t>
+      </w:r>
+      <w:r>
+        <w:t xml:space="preserve">first-time users. The manuscript now traces two concrete design responses:</w:t>
+      </w:r>
+      <w:r>
+        <w:t xml:space="preserve"> </w:t>
+      </w:r>
+      <w:r>
+        <w:t xml:space="preserve">the new</w:t>
+      </w:r>
+      <w:r>
+        <w:t xml:space="preserve"> </w:t>
+      </w:r>
+      <w:r>
+        <w:rPr>
+          <w:i/>
+          <w:iCs/>
+        </w:rPr>
+        <w:t xml:space="preserve">Teaching and learning context</w:t>
+      </w:r>
+      <w:r>
+        <w:t xml:space="preserve"> </w:t>
+      </w:r>
+      <w:r>
+        <w:t xml:space="preserve">section and the expanded lessons</w:t>
+      </w:r>
+      <w:r>
+        <w:t xml:space="preserve"> </w:t>
+      </w:r>
+      <w:r>
+        <w:t xml:space="preserve">address the applicability concern, and a guided four-step tour added to the</w:t>
+      </w:r>
+      <w:r>
+        <w:t xml:space="preserve"> </w:t>
+      </w:r>
+      <w:r>
+        <w:t xml:space="preserve">application itself addresses the on-ramp concern. Because the input was</w:t>
+      </w:r>
+      <w:r>
+        <w:t xml:space="preserve"> </w:t>
+      </w:r>
+      <w:r>
+        <w:t xml:space="preserve">solicited as service-improvement feedback rather than as human-subjects</w:t>
+      </w:r>
+      <w:r>
+        <w:t xml:space="preserve"> </w:t>
+      </w:r>
+      <w:r>
+        <w:t xml:space="preserve">research, the section reports themes in aggregate form only; no identifying</w:t>
+      </w:r>
+      <w:r>
+        <w:t xml:space="preserve"> </w:t>
+      </w:r>
+      <w:r>
+        <w:t xml:space="preserve">or quantified data are presented, and a brief note to that effect appears in</w:t>
+      </w:r>
+      <w:r>
+        <w:t xml:space="preserve"> </w:t>
+      </w:r>
+      <w:r>
+        <w:t xml:space="preserve">the</w:t>
+      </w:r>
+      <w:r>
+        <w:t xml:space="preserve"> </w:t>
+      </w:r>
+      <w:r>
+        <w:rPr>
+          <w:i/>
+          <w:iCs/>
+        </w:rPr>
+        <w:t xml:space="preserve">Disclosure statement</w:t>
+      </w:r>
+      <w:r>
+        <w:t xml:space="preserve">. The</w:t>
+      </w:r>
+      <w:r>
+        <w:t xml:space="preserve"> </w:t>
+      </w:r>
+      <w:r>
+        <w:rPr>
+          <w:i/>
+          <w:iCs/>
+        </w:rPr>
+        <w:t xml:space="preserve">Limitations</w:t>
+      </w:r>
+      <w:r>
+        <w:t xml:space="preserve"> </w:t>
+      </w:r>
+      <w:r>
+        <w:t xml:space="preserve">are explicit on what this is</w:t>
+      </w:r>
+      <w:r>
+        <w:t xml:space="preserve"> </w:t>
+      </w:r>
+      <w:r>
+        <w:t xml:space="preserve">and is not: Empiria has not been studied in a classroom or experimental</w:t>
+      </w:r>
+      <w:r>
+        <w:t xml:space="preserve"> </w:t>
+      </w:r>
+      <w:r>
+        <w:t xml:space="preserve">setting and we make no claim about its effect on student understanding; a</w:t>
+      </w:r>
+      <w:r>
+        <w:t xml:space="preserve"> </w:t>
+      </w:r>
+      <w:r>
+        <w:t xml:space="preserve">formal evaluation is identified as a possible future extension.</w:t>
       </w:r>
     </w:p>
     <w:p>
@@ -258,79 +540,73 @@
         <w:pStyle w:val="BodyText"/>
       </w:pPr>
       <w:r>
-        <w:t xml:space="preserve">A brief word on where this comes from. I am a postdoctoral researcher at the</w:t>
-      </w:r>
-      <w:r>
-        <w:t xml:space="preserve"> </w:t>
-      </w:r>
-      <w:r>
-        <w:t xml:space="preserve">Institute of Communication and Public Policy at USI, where my work concerns</w:t>
-      </w:r>
-      <w:r>
-        <w:t xml:space="preserve"> </w:t>
-      </w:r>
-      <w:r>
-        <w:t xml:space="preserve">quantitative methods in the social sciences. Empiria grew out of an unexpected</w:t>
-      </w:r>
-      <w:r>
-        <w:t xml:space="preserve"> </w:t>
-      </w:r>
-      <w:r>
-        <w:t xml:space="preserve">overlap between that work and a long-standing hobby of mine, patching modular</w:t>
-      </w:r>
-      <w:r>
-        <w:t xml:space="preserve"> </w:t>
-      </w:r>
-      <w:r>
-        <w:t xml:space="preserve">synthesizers. A modular synth is a live, visual, tactile computer: you build a</w:t>
-      </w:r>
-      <w:r>
-        <w:t xml:space="preserve"> </w:t>
-      </w:r>
-      <w:r>
-        <w:t xml:space="preserve">process by wiring small modules together and hear it change as you turn a knob.</w:t>
-      </w:r>
-      <w:r>
-        <w:t xml:space="preserve"> </w:t>
-      </w:r>
-      <w:r>
-        <w:t xml:space="preserve">That is also the spirit of the older analog-computing tradition, in which a</w:t>
-      </w:r>
-      <w:r>
-        <w:t xml:space="preserve"> </w:t>
-      </w:r>
-      <w:r>
-        <w:t xml:space="preserve">calculation was something physical you could see and adjust rather than a hidden</w:t>
-      </w:r>
-      <w:r>
-        <w:t xml:space="preserve"> </w:t>
-      </w:r>
-      <w:r>
-        <w:t xml:space="preserve">function call. Empiria brings that sensibility to statistics, so that the</w:t>
-      </w:r>
-      <w:r>
-        <w:t xml:space="preserve"> </w:t>
-      </w:r>
-      <w:r>
-        <w:t xml:space="preserve">inferential workflow becomes something a student assembles, touches, and watches</w:t>
-      </w:r>
-      <w:r>
-        <w:t xml:space="preserve"> </w:t>
-      </w:r>
-      <w:r>
-        <w:t xml:space="preserve">respond in real time. I have written the article for practitioners, in the hope</w:t>
-      </w:r>
-      <w:r>
-        <w:t xml:space="preserve"> </w:t>
-      </w:r>
-      <w:r>
-        <w:t xml:space="preserve">of adding to the conversation about hands-on and alternative ways of conveying</w:t>
-      </w:r>
-      <w:r>
-        <w:t xml:space="preserve"> </w:t>
-      </w:r>
-      <w:r>
-        <w:t xml:space="preserve">statistical ideas.</w:t>
+        <w:t xml:space="preserve">Two smaller changes followed the same line of feedback. The</w:t>
+      </w:r>
+      <w:r>
+        <w:t xml:space="preserve"> </w:t>
+      </w:r>
+      <w:r>
+        <w:rPr>
+          <w:i/>
+          <w:iCs/>
+        </w:rPr>
+        <w:t xml:space="preserve">Computational</w:t>
+      </w:r>
+      <w:r>
+        <w:rPr>
+          <w:i/>
+          <w:iCs/>
+        </w:rPr>
+        <w:t xml:space="preserve"> </w:t>
+      </w:r>
+      <w:r>
+        <w:rPr>
+          <w:i/>
+          <w:iCs/>
+        </w:rPr>
+        <w:t xml:space="preserve">footprint</w:t>
+      </w:r>
+      <w:r>
+        <w:t xml:space="preserve"> </w:t>
+      </w:r>
+      <w:r>
+        <w:t xml:space="preserve">paragraph has been condensed, with the full benchmark moved into</w:t>
+      </w:r>
+      <w:r>
+        <w:t xml:space="preserve"> </w:t>
+      </w:r>
+      <w:r>
+        <w:t xml:space="preserve">the Supplementary Materials, in keeping with the journal’s preference to</w:t>
+      </w:r>
+      <w:r>
+        <w:t xml:space="preserve"> </w:t>
+      </w:r>
+      <w:r>
+        <w:t xml:space="preserve">minimize formal material in the body. The numerical-correctness story is</w:t>
+      </w:r>
+      <w:r>
+        <w:t xml:space="preserve"> </w:t>
+      </w:r>
+      <w:r>
+        <w:t xml:space="preserve">unchanged: closed-form routines remain verified against R to machine precision</w:t>
+      </w:r>
+      <w:r>
+        <w:t xml:space="preserve"> </w:t>
+      </w:r>
+      <w:r>
+        <w:t xml:space="preserve">by an automated suite of 41 checks, with an independent R reference script</w:t>
+      </w:r>
+      <w:r>
+        <w:t xml:space="preserve"> </w:t>
+      </w:r>
+      <w:r>
+        <w:t xml:space="preserve">that a reviewer can rerun in minutes; the full validation table sits in the</w:t>
+      </w:r>
+      <w:r>
+        <w:t xml:space="preserve"> </w:t>
+      </w:r>
+      <w:r>
+        <w:t xml:space="preserve">Supplementary Materials, with the in-text section pointing to it.</w:t>
       </w:r>
     </w:p>
     <w:p>
@@ -338,25 +614,79 @@
         <w:pStyle w:val="BodyText"/>
       </w:pPr>
       <w:r>
-        <w:t xml:space="preserve">The article describes an educational technology and its design rationale; it</w:t>
-      </w:r>
-      <w:r>
-        <w:t xml:space="preserve"> </w:t>
-      </w:r>
-      <w:r>
-        <w:t xml:space="preserve">does not yet report a classroom evaluation, which it states explicitly and</w:t>
-      </w:r>
-      <w:r>
-        <w:t xml:space="preserve"> </w:t>
-      </w:r>
-      <w:r>
-        <w:t xml:space="preserve">frames as planned future work. The software is freely available, so reviewers</w:t>
-      </w:r>
-      <w:r>
-        <w:t xml:space="preserve"> </w:t>
-      </w:r>
-      <w:r>
-        <w:t xml:space="preserve">can use it directly and inspect its source and tests.</w:t>
+        <w:t xml:space="preserve">A brief word on context. I am a postdoctoral researcher at the Institute of</w:t>
+      </w:r>
+      <w:r>
+        <w:t xml:space="preserve"> </w:t>
+      </w:r>
+      <w:r>
+        <w:t xml:space="preserve">Communication and Public Policy at USI, where my work concerns quantitative</w:t>
+      </w:r>
+      <w:r>
+        <w:t xml:space="preserve"> </w:t>
+      </w:r>
+      <w:r>
+        <w:t xml:space="preserve">methods in the social sciences. Empiria grew out of an unexpected overlap</w:t>
+      </w:r>
+      <w:r>
+        <w:t xml:space="preserve"> </w:t>
+      </w:r>
+      <w:r>
+        <w:t xml:space="preserve">between that work and a long-standing hobby of mine, patching modular</w:t>
+      </w:r>
+      <w:r>
+        <w:t xml:space="preserve"> </w:t>
+      </w:r>
+      <w:r>
+        <w:t xml:space="preserve">synthesizers. A modular synth is a live, visual, tactile computer: you build</w:t>
+      </w:r>
+      <w:r>
+        <w:t xml:space="preserve"> </w:t>
+      </w:r>
+      <w:r>
+        <w:t xml:space="preserve">a process by wiring small modules together and hear it change as you turn a</w:t>
+      </w:r>
+      <w:r>
+        <w:t xml:space="preserve"> </w:t>
+      </w:r>
+      <w:r>
+        <w:t xml:space="preserve">knob. That is also the spirit of the older analog-computing tradition, in</w:t>
+      </w:r>
+      <w:r>
+        <w:t xml:space="preserve"> </w:t>
+      </w:r>
+      <w:r>
+        <w:t xml:space="preserve">which a calculation was something physical you could see and adjust rather</w:t>
+      </w:r>
+      <w:r>
+        <w:t xml:space="preserve"> </w:t>
+      </w:r>
+      <w:r>
+        <w:t xml:space="preserve">than a hidden function call. Empiria brings that sensibility to statistics, so</w:t>
+      </w:r>
+      <w:r>
+        <w:t xml:space="preserve"> </w:t>
+      </w:r>
+      <w:r>
+        <w:t xml:space="preserve">that the inferential workflow becomes something a student assembles, touches,</w:t>
+      </w:r>
+      <w:r>
+        <w:t xml:space="preserve"> </w:t>
+      </w:r>
+      <w:r>
+        <w:t xml:space="preserve">and watches respond in real time. I have written the article for</w:t>
+      </w:r>
+      <w:r>
+        <w:t xml:space="preserve"> </w:t>
+      </w:r>
+      <w:r>
+        <w:t xml:space="preserve">practitioners, in the hope of adding to the conversation about hands-on and</w:t>
+      </w:r>
+      <w:r>
+        <w:t xml:space="preserve"> </w:t>
+      </w:r>
+      <w:r>
+        <w:t xml:space="preserve">alternative ways of conveying statistical ideas.</w:t>
       </w:r>
     </w:p>
     <w:p>
@@ -390,7 +720,7 @@
         <w:pStyle w:val="BodyText"/>
       </w:pPr>
       <w:r>
-        <w:t xml:space="preserve">Thank you for your consideration.</w:t>
+        <w:t xml:space="preserve">Thank you for your continued consideration.</w:t>
       </w:r>
     </w:p>
     <w:p>

</xml_diff>